<commit_message>
feat: add reading selection scheduling and anonymous peer review
</commit_message>
<xml_diff>
--- a/网站功能说明-更新版.docx
+++ b/网站功能说明-更新版.docx
@@ -1304,14 +1304,15 @@
         <w:pStyle w:val="ListBullet"/>
       </w:pPr>
       <w:r>
-        <w:t>开放/关闭选文通道：</w:t>
+        <w:t>手动开放/关闭选文：/reading/manual-open/&lt;file_id&gt;、/reading/manual-close/&lt;file_id&gt;</w:t>
       </w:r>
+    </w:p>
+    <w:p>
+      <w:pPr>
+        <w:pStyle w:val="ListBullet"/>
+      </w:pPr>
       <w:r>
-        <w:rPr>
-          <w:rFonts w:ascii="Consolas" w:hAnsi="Consolas" w:eastAsia="Consolas"/>
-          <w:sz w:val="19"/>
-        </w:rPr>
-        <w:t>/reading/toggle-open/&lt;file_id&gt;</w:t>
+        <w:t>设置每个主题选文时间：/reading/schedule/&lt;file_id&gt;</w:t>
       </w:r>
     </w:p>
     <w:p>
@@ -1374,6 +1375,30 @@
         <w:pStyle w:val="ListBullet"/>
       </w:pPr>
       <w:r>
+        <w:t>教师可提前设置选文开始/结束时间，到达结束时间或选满两位学生后自动关闭</w:t>
+      </w:r>
+    </w:p>
+    <w:p>
+      <w:pPr>
+        <w:pStyle w:val="ListBullet"/>
+      </w:pPr>
+      <w:r>
+        <w:t>选文结束后，其他学生仅可查看文献，不能继续选择</w:t>
+      </w:r>
+    </w:p>
+    <w:p>
+      <w:pPr>
+        <w:pStyle w:val="ListBullet"/>
+      </w:pPr>
+      <w:r>
+        <w:t>学生和教师均可按周次、主题查看不同 reading list 的文献</w:t>
+      </w:r>
+    </w:p>
+    <w:p>
+      <w:pPr>
+        <w:pStyle w:val="ListBullet"/>
+      </w:pPr>
+      <w:r>
         <w:t>管理员可取消选文：</w:t>
       </w:r>
       <w:r>
@@ -1442,14 +1467,7 @@
         <w:pStyle w:val="ListBullet"/>
       </w:pPr>
       <w:r>
-        <w:t>学生互评：</w:t>
-      </w:r>
-      <w:r>
-        <w:rPr>
-          <w:rFonts w:ascii="Consolas" w:hAnsi="Consolas" w:eastAsia="Consolas"/>
-          <w:sz w:val="19"/>
-        </w:rPr>
-        <w:t>/reading/score/&lt;selection_id&gt;</w:t>
+        <w:t>所有学生都可对其他同学评分并填写反馈：/reading/score/&lt;selection_id&gt;</w:t>
       </w:r>
     </w:p>
     <w:p>
@@ -1458,6 +1476,14 @@
       </w:pPr>
       <w:r>
         <w:t>评分维度：内容理解、学习态度、讲授思路、启发性、激发听众、回答问题</w:t>
+      </w:r>
+    </w:p>
+    <w:p>
+      <w:pPr>
+        <w:pStyle w:val="ListBullet"/>
+      </w:pPr>
+      <w:r>
+        <w:t>学生可查看自己收到的匿名评分和反馈，不显示具体评分人姓名</w:t>
       </w:r>
     </w:p>
     <w:p>

</xml_diff>